<commit_message>
Escribe Actividad 5.1 completa y valida en vivo el diagnóstico de incidencias con CloudWatch
Monitorización con agente CloudWatch, dashboard de tres capas, alarmas y
diagnóstico de una incidencia real de conectividad a RDS, con EventBridge
como cuarta señal puntuable. Corrige en vivo el mecanismo real para forzar
el fallo (los grupos de seguridad no cortan conexiones ya establecidas,
hace falta reiniciar la RDS) y el espaciado roto entre solvedBox y
captureBox en la plantilla del profesor.
</commit_message>
<xml_diff>
--- a/docs/tema5/plantillas/Actividad_5_1_INU_Plantilla.docx
+++ b/docs/tema5/plantillas/Actividad_5_1_INU_Plantilla.docx
@@ -139,7 +139,7 @@
                 <w:sz w:val="20"/>
                 <w:szCs w:val="20"/>
               </w:rPr>
-              <w:t xml:space="preserve">Nombre y apellidos: _______________________________________________________</w:t>
+              <w:t xml:space="preserve">Nombre y apellidos: _____________________________________________________</w:t>
             </w:r>
           </w:p>
           <w:p>
@@ -167,7 +167,7 @@
                 <w:sz w:val="20"/>
                 <w:szCs w:val="20"/>
               </w:rPr>
-              <w:t xml:space="preserve">Identificador de recursos usado (ej. entradas-&lt;tu-identificador&gt;): _______________________</w:t>
+              <w:t xml:space="preserve">Identificador de recursos usado (ej. escaparate-asg-&lt;tu-identificador&gt;): _______________________</w:t>
             </w:r>
           </w:p>
         </w:tc>
@@ -198,7 +198,7 @@
           <w:sz w:val="26"/>
           <w:szCs w:val="26"/>
         </w:rPr>
-        <w:t xml:space="preserve">Parte A — Panel y tres alarmas</w:t>
+        <w:t xml:space="preserve">Parte A — Métricas, logs, dashboard y alarmas</w:t>
       </w:r>
     </w:p>
     <w:p>
@@ -222,7 +222,7 @@
           <w:sz w:val="24"/>
           <w:szCs w:val="24"/>
         </w:rPr>
-        <w:t xml:space="preserve">Paso 1 — Lanza la instancia de Entradas desde la consola</w:t>
+        <w:t xml:space="preserve">Paso 0 — Reactiva la arquitectura de la 4.1</w:t>
       </w:r>
     </w:p>
     <w:tbl>
@@ -268,7 +268,7 @@
                 <w:sz w:val="20"/>
                 <w:szCs w:val="20"/>
               </w:rPr>
-              <w:t xml:space="preserve">📸 Entradas respondiendo en el navegador, con el catálogo de conciertos</w:t>
+              <w:t xml:space="preserve">📸 El grupo de destino con las dos instancias healthy, y el catálogo cargando con datos reales</w:t>
             </w:r>
           </w:p>
         </w:tc>
@@ -315,7 +315,7 @@
     </w:tbl>
     <w:p>
       <w:pPr>
-        <w:spacing w:after="160"/>
+        <w:spacing w:after="200"/>
       </w:pPr>
     </w:p>
     <w:p>
@@ -334,7 +334,7 @@
           <w:sz w:val="24"/>
           <w:szCs w:val="24"/>
         </w:rPr>
-        <w:t xml:space="preserve">Paso 2 — Construye el panel desde la consola</w:t>
+        <w:t xml:space="preserve">Paso 1 — Instala el agente de CloudWatch en la plantilla de lanzamiento</w:t>
       </w:r>
     </w:p>
     <w:tbl>
@@ -380,7 +380,7 @@
                 <w:sz w:val="20"/>
                 <w:szCs w:val="20"/>
               </w:rPr>
-              <w:t xml:space="preserve">📸 Panel de CloudWatch con los tres widgets mostrando actividad real</w:t>
+              <w:t xml:space="preserve">📸 La métrica de memoria del agente (CWAgent) con datos reales, y el grupo de registros mostrando al menos una entrada</w:t>
             </w:r>
           </w:p>
         </w:tc>
@@ -429,6 +429,11 @@
       <w:pPr>
         <w:spacing w:after="200"/>
       </w:pPr>
+    </w:p>
+    <w:p>
+      <w:r>
+        <w:br w:type="page"/>
+      </w:r>
     </w:p>
     <w:p>
       <w:pPr>
@@ -446,7 +451,7 @@
           <w:sz w:val="24"/>
           <w:szCs w:val="24"/>
         </w:rPr>
-        <w:t xml:space="preserve">Paso 3 — Crea dos alarmas por CLI</w:t>
+        <w:t xml:space="preserve">Paso 2 — Construye un dashboard con las tres capas</w:t>
       </w:r>
     </w:p>
     <w:tbl>
@@ -492,7 +497,7 @@
                 <w:sz w:val="20"/>
                 <w:szCs w:val="20"/>
               </w:rPr>
-              <w:t xml:space="preserve">📸 Las dos alarmas listadas con su estado y su umbral configurado</w:t>
+              <w:t xml:space="preserve">📸 El dashboard completo con los tres widgets (borde, aplicación, datos) visibles</w:t>
             </w:r>
           </w:p>
         </w:tc>
@@ -541,11 +546,6 @@
       <w:pPr>
         <w:spacing w:after="200"/>
       </w:pPr>
-    </w:p>
-    <w:p>
-      <w:r>
-        <w:br w:type="page"/>
-      </w:r>
     </w:p>
     <w:p>
       <w:pPr>
@@ -563,7 +563,7 @@
           <w:sz w:val="24"/>
           <w:szCs w:val="24"/>
         </w:rPr>
-        <w:t xml:space="preserve">Paso 4 — Localiza dónde controlar el gasto acumulado</w:t>
+        <w:t xml:space="preserve">Paso 3 — Diseña y crea dos de las tres alarmas (la tercera espera a la Parte B)</w:t>
       </w:r>
     </w:p>
     <w:tbl>
@@ -609,7 +609,7 @@
                 <w:sz w:val="20"/>
                 <w:szCs w:val="20"/>
               </w:rPr>
-              <w:t xml:space="preserve">📸 Alarma de gasto acumulado, o panel de crédito del Learner Lab</w:t>
+              <w:t xml:space="preserve">📸 Las dos alarmas en la lista de CloudWatch, con su estado y su métrica visibles</w:t>
             </w:r>
           </w:p>
         </w:tc>
@@ -656,8 +656,13 @@
     </w:tbl>
     <w:p>
       <w:pPr>
-        <w:spacing w:after="160"/>
-      </w:pPr>
+        <w:spacing w:after="200"/>
+      </w:pPr>
+    </w:p>
+    <w:p>
+      <w:r>
+        <w:br w:type="page"/>
+      </w:r>
     </w:p>
     <w:p>
       <w:pPr>
@@ -675,21 +680,7 @@
           <w:sz w:val="24"/>
           <w:szCs w:val="24"/>
         </w:rPr>
-        <w:t xml:space="preserve">Reflexiona</w:t>
-      </w:r>
-    </w:p>
-    <w:p>
-      <w:pPr>
-        <w:spacing w:after="100"/>
-      </w:pPr>
-      <w:r>
-        <w:rPr>
-          <w:rFonts w:ascii="Arial" w:cs="Arial" w:eastAsia="Arial" w:hAnsi="Arial"/>
-          <w:color w:val="212121"/>
-          <w:sz w:val="22"/>
-          <w:szCs w:val="22"/>
-        </w:rPr>
-        <w:t xml:space="preserve">De las tres alarmas, ¿cuál te habría avisado antes de un problema real y cuál solo te lo habría confirmado después de que ya hubiera pasado?</w:t>
+        <w:t xml:space="preserve">Paso 4 — Genera carga real y observa la alarma de CPU</w:t>
       </w:r>
     </w:p>
     <w:tbl>
@@ -708,8 +699,41 @@
         <w:gridCol w:w="9638"/>
       </w:tblGrid>
       <w:tr>
+        <w:tc>
+          <w:tcPr>
+            <w:tcW w:type="dxa" w:w="9638"/>
+            <w:tcBorders>
+              <w:top w:val="none" w:color="FFFFFF" w:sz="0"/>
+              <w:left w:val="none" w:color="FFFFFF" w:sz="0"/>
+              <w:bottom w:val="none" w:color="FFFFFF" w:sz="0"/>
+              <w:right w:val="none" w:color="FFFFFF" w:sz="0"/>
+            </w:tcBorders>
+            <w:shd w:fill="3949AB" w:val="clear"/>
+            <w:tcMar>
+              <w:top w:type="dxa" w:w="80"/>
+              <w:left w:type="dxa" w:w="160"/>
+              <w:bottom w:type="dxa" w:w="80"/>
+              <w:right w:type="dxa" w:w="160"/>
+            </w:tcMar>
+          </w:tcPr>
+          <w:p>
+            <w:r>
+              <w:rPr>
+                <w:rFonts w:ascii="Arial" w:cs="Arial" w:eastAsia="Arial" w:hAnsi="Arial"/>
+                <w:b/>
+                <w:bCs/>
+                <w:color w:val="FFFFFF"/>
+                <w:sz w:val="20"/>
+                <w:szCs w:val="20"/>
+              </w:rPr>
+              <w:t xml:space="preserve">📸 La alarma de CPU en estado En alarma (o acercándose al umbral), junto con el widget del dashboard mostrando la misma subida</w:t>
+            </w:r>
+          </w:p>
+        </w:tc>
+      </w:tr>
+      <w:tr>
         <w:trPr>
-          <w:trHeight w:val="480"/>
+          <w:trHeight w:val="2400"/>
         </w:trPr>
         <w:tc>
           <w:tcPr>
@@ -722,115 +746,26 @@
             </w:tcBorders>
             <w:shd w:fill="FAFAFA" w:val="clear"/>
             <w:tcMar>
-              <w:top w:type="dxa" w:w="60"/>
-              <w:left w:type="dxa" w:w="160"/>
-              <w:bottom w:type="dxa" w:w="60"/>
-              <w:right w:type="dxa" w:w="160"/>
-            </w:tcMar>
-          </w:tcPr>
-          <w:p>
-            <w:r>
-              <w:rPr>
-                <w:sz w:val="22"/>
-                <w:szCs w:val="22"/>
-              </w:rPr>
-              <w:t xml:space="preserve"/>
-            </w:r>
-          </w:p>
-        </w:tc>
-      </w:tr>
-      <w:tr>
-        <w:trPr>
-          <w:trHeight w:val="480"/>
-        </w:trPr>
-        <w:tc>
-          <w:tcPr>
-            <w:tcW w:type="dxa" w:w="9638"/>
-            <w:tcBorders>
-              <w:top w:val="single" w:color="E0E0E0" w:sz="4"/>
-              <w:left w:val="single" w:color="E0E0E0" w:sz="4"/>
-              <w:bottom w:val="single" w:color="E0E0E0" w:sz="4"/>
-              <w:right w:val="single" w:color="E0E0E0" w:sz="4"/>
-            </w:tcBorders>
-            <w:shd w:fill="FAFAFA" w:val="clear"/>
-            <w:tcMar>
-              <w:top w:type="dxa" w:w="60"/>
-              <w:left w:type="dxa" w:w="160"/>
-              <w:bottom w:type="dxa" w:w="60"/>
-              <w:right w:type="dxa" w:w="160"/>
-            </w:tcMar>
-          </w:tcPr>
-          <w:p>
-            <w:r>
-              <w:rPr>
-                <w:sz w:val="22"/>
-                <w:szCs w:val="22"/>
-              </w:rPr>
-              <w:t xml:space="preserve"/>
-            </w:r>
-          </w:p>
-        </w:tc>
-      </w:tr>
-      <w:tr>
-        <w:trPr>
-          <w:trHeight w:val="480"/>
-        </w:trPr>
-        <w:tc>
-          <w:tcPr>
-            <w:tcW w:type="dxa" w:w="9638"/>
-            <w:tcBorders>
-              <w:top w:val="single" w:color="E0E0E0" w:sz="4"/>
-              <w:left w:val="single" w:color="E0E0E0" w:sz="4"/>
-              <w:bottom w:val="single" w:color="E0E0E0" w:sz="4"/>
-              <w:right w:val="single" w:color="E0E0E0" w:sz="4"/>
-            </w:tcBorders>
-            <w:shd w:fill="FAFAFA" w:val="clear"/>
-            <w:tcMar>
-              <w:top w:type="dxa" w:w="60"/>
-              <w:left w:type="dxa" w:w="160"/>
-              <w:bottom w:type="dxa" w:w="60"/>
-              <w:right w:type="dxa" w:w="160"/>
-            </w:tcMar>
-          </w:tcPr>
-          <w:p>
-            <w:r>
-              <w:rPr>
-                <w:sz w:val="22"/>
-                <w:szCs w:val="22"/>
-              </w:rPr>
-              <w:t xml:space="preserve"/>
-            </w:r>
-          </w:p>
-        </w:tc>
-      </w:tr>
-      <w:tr>
-        <w:trPr>
-          <w:trHeight w:val="480"/>
-        </w:trPr>
-        <w:tc>
-          <w:tcPr>
-            <w:tcW w:type="dxa" w:w="9638"/>
-            <w:tcBorders>
-              <w:top w:val="single" w:color="E0E0E0" w:sz="4"/>
-              <w:left w:val="single" w:color="E0E0E0" w:sz="4"/>
-              <w:bottom w:val="single" w:color="E0E0E0" w:sz="4"/>
-              <w:right w:val="single" w:color="E0E0E0" w:sz="4"/>
-            </w:tcBorders>
-            <w:shd w:fill="FAFAFA" w:val="clear"/>
-            <w:tcMar>
-              <w:top w:type="dxa" w:w="60"/>
-              <w:left w:type="dxa" w:w="160"/>
-              <w:bottom w:type="dxa" w:w="60"/>
-              <w:right w:type="dxa" w:w="160"/>
-            </w:tcMar>
-          </w:tcPr>
-          <w:p>
-            <w:r>
-              <w:rPr>
-                <w:sz w:val="22"/>
-                <w:szCs w:val="22"/>
-              </w:rPr>
-              <w:t xml:space="preserve"/>
+              <w:top w:type="dxa" w:w="80"/>
+              <w:left w:type="dxa" w:w="160"/>
+              <w:bottom w:type="dxa" w:w="80"/>
+              <w:right w:type="dxa" w:w="160"/>
+            </w:tcMar>
+          </w:tcPr>
+          <w:p>
+            <w:pPr>
+              <w:jc w:val="center"/>
+            </w:pPr>
+            <w:r>
+              <w:rPr>
+                <w:rFonts w:ascii="Arial" w:cs="Arial" w:eastAsia="Arial" w:hAnsi="Arial"/>
+                <w:i/>
+                <w:iCs/>
+                <w:color w:val="757575"/>
+                <w:sz w:val="20"/>
+                <w:szCs w:val="20"/>
+              </w:rPr>
+              <w:t xml:space="preserve">[Pega aquí la captura de pantalla]</w:t>
             </w:r>
           </w:p>
         </w:tc>
@@ -861,7 +796,7 @@
           <w:sz w:val="26"/>
           <w:szCs w:val="26"/>
         </w:rPr>
-        <w:t xml:space="preserve">Parte B — Reto: diagnostica a ciegas</w:t>
+        <w:t xml:space="preserve">Parte B — Reto: rompe algo a propósito y diagnostícalo a ciegas</w:t>
       </w:r>
     </w:p>
     <w:p>
@@ -885,7 +820,7 @@
           <w:sz w:val="24"/>
           <w:szCs w:val="24"/>
         </w:rPr>
-        <w:t xml:space="preserve">Proceso de diagnóstico documentado</w:t>
+        <w:t xml:space="preserve">Predice, rompe la conexión a la base de datos, y diagnostica siguiendo el orden de la teoría</w:t>
       </w:r>
     </w:p>
     <w:p>
@@ -899,7 +834,7 @@
           <w:sz w:val="22"/>
           <w:szCs w:val="22"/>
         </w:rPr>
-        <w:t xml:space="preserve">Qué has mirado primero y por qué, qué descartaste y por qué, y qué evidencia concreta te ha llevado a identificar la causa real de la incidencia.</w:t>
+        <w:t xml:space="preserve">Tu predicción (antes de romper nada): ¿qué esperas ver en cada una de las tres capas del dashboard si Escaparate deja de poder conectarse a su base de datos?</w:t>
       </w:r>
     </w:p>
     <w:tbl>
@@ -1013,126 +948,11 @@
           </w:p>
         </w:tc>
       </w:tr>
-      <w:tr>
-        <w:trPr>
-          <w:trHeight w:val="480"/>
-        </w:trPr>
-        <w:tc>
-          <w:tcPr>
-            <w:tcW w:type="dxa" w:w="9638"/>
-            <w:tcBorders>
-              <w:top w:val="single" w:color="E0E0E0" w:sz="4"/>
-              <w:left w:val="single" w:color="E0E0E0" w:sz="4"/>
-              <w:bottom w:val="single" w:color="E0E0E0" w:sz="4"/>
-              <w:right w:val="single" w:color="E0E0E0" w:sz="4"/>
-            </w:tcBorders>
-            <w:shd w:fill="FAFAFA" w:val="clear"/>
-            <w:tcMar>
-              <w:top w:type="dxa" w:w="60"/>
-              <w:left w:type="dxa" w:w="160"/>
-              <w:bottom w:type="dxa" w:w="60"/>
-              <w:right w:type="dxa" w:w="160"/>
-            </w:tcMar>
-          </w:tcPr>
-          <w:p>
-            <w:r>
-              <w:rPr>
-                <w:sz w:val="22"/>
-                <w:szCs w:val="22"/>
-              </w:rPr>
-              <w:t xml:space="preserve"/>
-            </w:r>
-          </w:p>
-        </w:tc>
-      </w:tr>
-      <w:tr>
-        <w:trPr>
-          <w:trHeight w:val="480"/>
-        </w:trPr>
-        <w:tc>
-          <w:tcPr>
-            <w:tcW w:type="dxa" w:w="9638"/>
-            <w:tcBorders>
-              <w:top w:val="single" w:color="E0E0E0" w:sz="4"/>
-              <w:left w:val="single" w:color="E0E0E0" w:sz="4"/>
-              <w:bottom w:val="single" w:color="E0E0E0" w:sz="4"/>
-              <w:right w:val="single" w:color="E0E0E0" w:sz="4"/>
-            </w:tcBorders>
-            <w:shd w:fill="FAFAFA" w:val="clear"/>
-            <w:tcMar>
-              <w:top w:type="dxa" w:w="60"/>
-              <w:left w:type="dxa" w:w="160"/>
-              <w:bottom w:type="dxa" w:w="60"/>
-              <w:right w:type="dxa" w:w="160"/>
-            </w:tcMar>
-          </w:tcPr>
-          <w:p>
-            <w:r>
-              <w:rPr>
-                <w:sz w:val="22"/>
-                <w:szCs w:val="22"/>
-              </w:rPr>
-              <w:t xml:space="preserve"/>
-            </w:r>
-          </w:p>
-        </w:tc>
-      </w:tr>
-      <w:tr>
-        <w:trPr>
-          <w:trHeight w:val="480"/>
-        </w:trPr>
-        <w:tc>
-          <w:tcPr>
-            <w:tcW w:type="dxa" w:w="9638"/>
-            <w:tcBorders>
-              <w:top w:val="single" w:color="E0E0E0" w:sz="4"/>
-              <w:left w:val="single" w:color="E0E0E0" w:sz="4"/>
-              <w:bottom w:val="single" w:color="E0E0E0" w:sz="4"/>
-              <w:right w:val="single" w:color="E0E0E0" w:sz="4"/>
-            </w:tcBorders>
-            <w:shd w:fill="FAFAFA" w:val="clear"/>
-            <w:tcMar>
-              <w:top w:type="dxa" w:w="60"/>
-              <w:left w:type="dxa" w:w="160"/>
-              <w:bottom w:type="dxa" w:w="60"/>
-              <w:right w:type="dxa" w:w="160"/>
-            </w:tcMar>
-          </w:tcPr>
-          <w:p>
-            <w:r>
-              <w:rPr>
-                <w:sz w:val="22"/>
-                <w:szCs w:val="22"/>
-              </w:rPr>
-              <w:t xml:space="preserve"/>
-            </w:r>
-          </w:p>
-        </w:tc>
-      </w:tr>
     </w:tbl>
     <w:p>
       <w:pPr>
-        <w:spacing w:after="160"/>
-      </w:pPr>
-    </w:p>
-    <w:p>
-      <w:pPr>
-        <w:pBdr>
-          <w:bottom w:val="single" w:color="FFA000" w:sz="4" w:space="1"/>
-        </w:pBdr>
-        <w:spacing w:after="120" w:before="240"/>
-      </w:pPr>
-      <w:r>
-        <w:rPr>
-          <w:rFonts w:ascii="Arial" w:cs="Arial" w:eastAsia="Arial" w:hAnsi="Arial"/>
-          <w:b/>
-          <w:bCs/>
-          <w:color w:val="3949AB"/>
-          <w:sz w:val="24"/>
-          <w:szCs w:val="24"/>
-        </w:rPr>
-        <w:t xml:space="preserve">Corrección aplicada</w:t>
-      </w:r>
+        <w:spacing w:after="120"/>
+      </w:pPr>
     </w:p>
     <w:tbl>
       <w:tblPr>
@@ -1177,7 +997,7 @@
                 <w:sz w:val="20"/>
                 <w:szCs w:val="20"/>
               </w:rPr>
-              <w:t xml:space="preserve">📸 Evidencia de que, tras tu corrección, la aplicación vuelve a comportarse con normalidad</w:t>
+              <w:t xml:space="preserve">📸 El momento exacto localizado en las métricas, la consulta de Logs Insights con el error real, el evento RevokeSecurityGroupIngress en CloudTrail con su hora y su usuario, y la confirmación final de que el catálogo vuelve a responder tras arreglarlo</w:t>
             </w:r>
           </w:p>
         </w:tc>
@@ -1243,7 +1063,21 @@
           <w:sz w:val="24"/>
           <w:szCs w:val="24"/>
         </w:rPr>
-        <w:t xml:space="preserve">Alarma nueva que la habría detectado antes</w:t>
+        <w:t xml:space="preserve">Justifica una retención de logs real</w:t>
+      </w:r>
+    </w:p>
+    <w:p>
+      <w:pPr>
+        <w:spacing w:after="100"/>
+      </w:pPr>
+      <w:r>
+        <w:rPr>
+          <w:rFonts w:ascii="Arial" w:cs="Arial" w:eastAsia="Arial" w:hAnsi="Arial"/>
+          <w:color w:val="212121"/>
+          <w:sz w:val="22"/>
+          <w:szCs w:val="22"/>
+        </w:rPr>
+        <w:t xml:space="preserve">Tu justificación de la retención elegida para el grupo de registros: ¿por qué ese número de días y no otro, pensando en cuánto tiempo necesitarías mirar hacia atrás para investigar una incidencia como la de este reto?</w:t>
       </w:r>
     </w:p>
     <w:tbl>
@@ -1262,41 +1096,8 @@
         <w:gridCol w:w="9638"/>
       </w:tblGrid>
       <w:tr>
-        <w:tc>
-          <w:tcPr>
-            <w:tcW w:type="dxa" w:w="9638"/>
-            <w:tcBorders>
-              <w:top w:val="none" w:color="FFFFFF" w:sz="0"/>
-              <w:left w:val="none" w:color="FFFFFF" w:sz="0"/>
-              <w:bottom w:val="none" w:color="FFFFFF" w:sz="0"/>
-              <w:right w:val="none" w:color="FFFFFF" w:sz="0"/>
-            </w:tcBorders>
-            <w:shd w:fill="3949AB" w:val="clear"/>
-            <w:tcMar>
-              <w:top w:type="dxa" w:w="80"/>
-              <w:left w:type="dxa" w:w="160"/>
-              <w:bottom w:type="dxa" w:w="80"/>
-              <w:right w:type="dxa" w:w="160"/>
-            </w:tcMar>
-          </w:tcPr>
-          <w:p>
-            <w:r>
-              <w:rPr>
-                <w:rFonts w:ascii="Arial" w:cs="Arial" w:eastAsia="Arial" w:hAnsi="Arial"/>
-                <w:b/>
-                <w:bCs/>
-                <w:color w:val="FFFFFF"/>
-                <w:sz w:val="20"/>
-                <w:szCs w:val="20"/>
-              </w:rPr>
-              <w:t xml:space="preserve">📸 La alarma nueva configurada, que se dispara si reproduces el mismo fallo</w:t>
-            </w:r>
-          </w:p>
-        </w:tc>
-      </w:tr>
-      <w:tr>
         <w:trPr>
-          <w:trHeight w:val="2400"/>
+          <w:trHeight w:val="480"/>
         </w:trPr>
         <w:tc>
           <w:tcPr>
@@ -1309,26 +1110,51 @@
             </w:tcBorders>
             <w:shd w:fill="FAFAFA" w:val="clear"/>
             <w:tcMar>
-              <w:top w:type="dxa" w:w="80"/>
-              <w:left w:type="dxa" w:w="160"/>
-              <w:bottom w:type="dxa" w:w="80"/>
-              <w:right w:type="dxa" w:w="160"/>
-            </w:tcMar>
-          </w:tcPr>
-          <w:p>
-            <w:pPr>
-              <w:jc w:val="center"/>
-            </w:pPr>
-            <w:r>
-              <w:rPr>
-                <w:rFonts w:ascii="Arial" w:cs="Arial" w:eastAsia="Arial" w:hAnsi="Arial"/>
-                <w:i/>
-                <w:iCs/>
-                <w:color w:val="757575"/>
-                <w:sz w:val="20"/>
-                <w:szCs w:val="20"/>
-              </w:rPr>
-              <w:t xml:space="preserve">[Pega aquí la captura de pantalla]</w:t>
+              <w:top w:type="dxa" w:w="60"/>
+              <w:left w:type="dxa" w:w="160"/>
+              <w:bottom w:type="dxa" w:w="60"/>
+              <w:right w:type="dxa" w:w="160"/>
+            </w:tcMar>
+          </w:tcPr>
+          <w:p>
+            <w:r>
+              <w:rPr>
+                <w:sz w:val="22"/>
+                <w:szCs w:val="22"/>
+              </w:rPr>
+              <w:t xml:space="preserve"/>
+            </w:r>
+          </w:p>
+        </w:tc>
+      </w:tr>
+      <w:tr>
+        <w:trPr>
+          <w:trHeight w:val="480"/>
+        </w:trPr>
+        <w:tc>
+          <w:tcPr>
+            <w:tcW w:type="dxa" w:w="9638"/>
+            <w:tcBorders>
+              <w:top w:val="single" w:color="E0E0E0" w:sz="4"/>
+              <w:left w:val="single" w:color="E0E0E0" w:sz="4"/>
+              <w:bottom w:val="single" w:color="E0E0E0" w:sz="4"/>
+              <w:right w:val="single" w:color="E0E0E0" w:sz="4"/>
+            </w:tcBorders>
+            <w:shd w:fill="FAFAFA" w:val="clear"/>
+            <w:tcMar>
+              <w:top w:type="dxa" w:w="60"/>
+              <w:left w:type="dxa" w:w="160"/>
+              <w:bottom w:type="dxa" w:w="60"/>
+              <w:right w:type="dxa" w:w="160"/>
+            </w:tcMar>
+          </w:tcPr>
+          <w:p>
+            <w:r>
+              <w:rPr>
+                <w:sz w:val="22"/>
+                <w:szCs w:val="22"/>
+              </w:rPr>
+              <w:t xml:space="preserve"/>
             </w:r>
           </w:p>
         </w:tc>
@@ -1338,20 +1164,6 @@
       <w:pPr>
         <w:spacing w:after="120"/>
       </w:pPr>
-    </w:p>
-    <w:p>
-      <w:pPr>
-        <w:spacing w:after="100"/>
-      </w:pPr>
-      <w:r>
-        <w:rPr>
-          <w:rFonts w:ascii="Arial" w:cs="Arial" w:eastAsia="Arial" w:hAnsi="Arial"/>
-          <w:color w:val="212121"/>
-          <w:sz w:val="22"/>
-          <w:szCs w:val="22"/>
-        </w:rPr>
-        <w:t xml:space="preserve">Si esa alarma hubiera existido desde el principio, ¿te habría avisado antes de que un usuario notara el problema?</w:t>
-      </w:r>
     </w:p>
     <w:tbl>
       <w:tblPr>
@@ -1369,8 +1181,41 @@
         <w:gridCol w:w="9638"/>
       </w:tblGrid>
       <w:tr>
+        <w:tc>
+          <w:tcPr>
+            <w:tcW w:type="dxa" w:w="9638"/>
+            <w:tcBorders>
+              <w:top w:val="none" w:color="FFFFFF" w:sz="0"/>
+              <w:left w:val="none" w:color="FFFFFF" w:sz="0"/>
+              <w:bottom w:val="none" w:color="FFFFFF" w:sz="0"/>
+              <w:right w:val="none" w:color="FFFFFF" w:sz="0"/>
+            </w:tcBorders>
+            <w:shd w:fill="3949AB" w:val="clear"/>
+            <w:tcMar>
+              <w:top w:type="dxa" w:w="80"/>
+              <w:left w:type="dxa" w:w="160"/>
+              <w:bottom w:type="dxa" w:w="80"/>
+              <w:right w:type="dxa" w:w="160"/>
+            </w:tcMar>
+          </w:tcPr>
+          <w:p>
+            <w:r>
+              <w:rPr>
+                <w:rFonts w:ascii="Arial" w:cs="Arial" w:eastAsia="Arial" w:hAnsi="Arial"/>
+                <w:b/>
+                <w:bCs/>
+                <w:color w:val="FFFFFF"/>
+                <w:sz w:val="20"/>
+                <w:szCs w:val="20"/>
+              </w:rPr>
+              <w:t xml:space="preserve">📸 La configuración de retención del grupo de registros, mostrando el valor elegido (no Nunca caduca)</w:t>
+            </w:r>
+          </w:p>
+        </w:tc>
+      </w:tr>
+      <w:tr>
         <w:trPr>
-          <w:trHeight w:val="480"/>
+          <w:trHeight w:val="2400"/>
         </w:trPr>
         <w:tc>
           <w:tcPr>
@@ -1383,26 +1228,106 @@
             </w:tcBorders>
             <w:shd w:fill="FAFAFA" w:val="clear"/>
             <w:tcMar>
-              <w:top w:type="dxa" w:w="60"/>
-              <w:left w:type="dxa" w:w="160"/>
-              <w:bottom w:type="dxa" w:w="60"/>
-              <w:right w:type="dxa" w:w="160"/>
-            </w:tcMar>
-          </w:tcPr>
-          <w:p>
-            <w:r>
-              <w:rPr>
-                <w:sz w:val="22"/>
-                <w:szCs w:val="22"/>
-              </w:rPr>
-              <w:t xml:space="preserve"/>
+              <w:top w:type="dxa" w:w="80"/>
+              <w:left w:type="dxa" w:w="160"/>
+              <w:bottom w:type="dxa" w:w="80"/>
+              <w:right w:type="dxa" w:w="160"/>
+            </w:tcMar>
+          </w:tcPr>
+          <w:p>
+            <w:pPr>
+              <w:jc w:val="center"/>
+            </w:pPr>
+            <w:r>
+              <w:rPr>
+                <w:rFonts w:ascii="Arial" w:cs="Arial" w:eastAsia="Arial" w:hAnsi="Arial"/>
+                <w:i/>
+                <w:iCs/>
+                <w:color w:val="757575"/>
+                <w:sz w:val="20"/>
+                <w:szCs w:val="20"/>
+              </w:rPr>
+              <w:t xml:space="preserve">[Pega aquí la captura de pantalla]</w:t>
+            </w:r>
+          </w:p>
+        </w:tc>
+      </w:tr>
+    </w:tbl>
+    <w:p>
+      <w:pPr>
+        <w:spacing w:after="160"/>
+      </w:pPr>
+    </w:p>
+    <w:p>
+      <w:pPr>
+        <w:pBdr>
+          <w:bottom w:val="single" w:color="FFA000" w:sz="4" w:space="1"/>
+        </w:pBdr>
+        <w:spacing w:after="120" w:before="240"/>
+      </w:pPr>
+      <w:r>
+        <w:rPr>
+          <w:rFonts w:ascii="Arial" w:cs="Arial" w:eastAsia="Arial" w:hAnsi="Arial"/>
+          <w:b/>
+          <w:bCs/>
+          <w:color w:val="3949AB"/>
+          <w:sz w:val="24"/>
+          <w:szCs w:val="24"/>
+        </w:rPr>
+        <w:t xml:space="preserve">Captura el cuarto tipo de señal con EventBridge</w:t>
+      </w:r>
+    </w:p>
+    <w:tbl>
+      <w:tblPr>
+        <w:tblW w:type="dxa" w:w="9638"/>
+        <w:tblBorders>
+          <w:top w:val="single" w:color="auto" w:sz="4"/>
+          <w:left w:val="single" w:color="auto" w:sz="4"/>
+          <w:bottom w:val="single" w:color="auto" w:sz="4"/>
+          <w:right w:val="single" w:color="auto" w:sz="4"/>
+          <w:insideH w:val="single" w:color="auto" w:sz="4"/>
+          <w:insideV w:val="single" w:color="auto" w:sz="4"/>
+        </w:tblBorders>
+      </w:tblPr>
+      <w:tblGrid>
+        <w:gridCol w:w="9638"/>
+      </w:tblGrid>
+      <w:tr>
+        <w:tc>
+          <w:tcPr>
+            <w:tcW w:type="dxa" w:w="9638"/>
+            <w:tcBorders>
+              <w:top w:val="none" w:color="FFFFFF" w:sz="0"/>
+              <w:left w:val="none" w:color="FFFFFF" w:sz="0"/>
+              <w:bottom w:val="none" w:color="FFFFFF" w:sz="0"/>
+              <w:right w:val="none" w:color="FFFFFF" w:sz="0"/>
+            </w:tcBorders>
+            <w:shd w:fill="3949AB" w:val="clear"/>
+            <w:tcMar>
+              <w:top w:type="dxa" w:w="80"/>
+              <w:left w:type="dxa" w:w="160"/>
+              <w:bottom w:type="dxa" w:w="80"/>
+              <w:right w:type="dxa" w:w="160"/>
+            </w:tcMar>
+          </w:tcPr>
+          <w:p>
+            <w:r>
+              <w:rPr>
+                <w:rFonts w:ascii="Arial" w:cs="Arial" w:eastAsia="Arial" w:hAnsi="Arial"/>
+                <w:b/>
+                <w:bCs/>
+                <w:color w:val="FFFFFF"/>
+                <w:sz w:val="20"/>
+                <w:szCs w:val="20"/>
+              </w:rPr>
+              <w:t xml:space="preserve">📸 La regla de EventBridge configurada, y la entrada del evento en el grupo de registros</w:t>
             </w:r>
           </w:p>
         </w:tc>
       </w:tr>
       <w:tr>
         <w:trPr>
-          <w:trHeight w:val="480"/>
+          <w:trHeight w:val="2400"/>
         </w:trPr>
         <w:tc>
           <w:tcPr>
@@ -1415,51 +1340,26 @@
             </w:tcBorders>
             <w:shd w:fill="FAFAFA" w:val="clear"/>
             <w:tcMar>
-              <w:top w:type="dxa" w:w="60"/>
-              <w:left w:type="dxa" w:w="160"/>
-              <w:bottom w:type="dxa" w:w="60"/>
-              <w:right w:type="dxa" w:w="160"/>
-            </w:tcMar>
-          </w:tcPr>
-          <w:p>
-            <w:r>
-              <w:rPr>
-                <w:sz w:val="22"/>
-                <w:szCs w:val="22"/>
-              </w:rPr>
-              <w:t xml:space="preserve"/>
-            </w:r>
-          </w:p>
-        </w:tc>
-      </w:tr>
-      <w:tr>
-        <w:trPr>
-          <w:trHeight w:val="480"/>
-        </w:trPr>
-        <w:tc>
-          <w:tcPr>
-            <w:tcW w:type="dxa" w:w="9638"/>
-            <w:tcBorders>
-              <w:top w:val="single" w:color="E0E0E0" w:sz="4"/>
-              <w:left w:val="single" w:color="E0E0E0" w:sz="4"/>
-              <w:bottom w:val="single" w:color="E0E0E0" w:sz="4"/>
-              <w:right w:val="single" w:color="E0E0E0" w:sz="4"/>
-            </w:tcBorders>
-            <w:shd w:fill="FAFAFA" w:val="clear"/>
-            <w:tcMar>
-              <w:top w:type="dxa" w:w="60"/>
-              <w:left w:type="dxa" w:w="160"/>
-              <w:bottom w:type="dxa" w:w="60"/>
-              <w:right w:type="dxa" w:w="160"/>
-            </w:tcMar>
-          </w:tcPr>
-          <w:p>
-            <w:r>
-              <w:rPr>
-                <w:sz w:val="22"/>
-                <w:szCs w:val="22"/>
-              </w:rPr>
-              <w:t xml:space="preserve"/>
+              <w:top w:type="dxa" w:w="80"/>
+              <w:left w:type="dxa" w:w="160"/>
+              <w:bottom w:type="dxa" w:w="80"/>
+              <w:right w:type="dxa" w:w="160"/>
+            </w:tcMar>
+          </w:tcPr>
+          <w:p>
+            <w:pPr>
+              <w:jc w:val="center"/>
+            </w:pPr>
+            <w:r>
+              <w:rPr>
+                <w:rFonts w:ascii="Arial" w:cs="Arial" w:eastAsia="Arial" w:hAnsi="Arial"/>
+                <w:i/>
+                <w:iCs/>
+                <w:color w:val="757575"/>
+                <w:sz w:val="20"/>
+                <w:szCs w:val="20"/>
+              </w:rPr>
+              <w:t xml:space="preserve">[Pega aquí la captura de pantalla]</w:t>
             </w:r>
           </w:p>
         </w:tc>

</xml_diff>